<commit_message>
Fix. Repositorio al 100 porciento (falta revisar)
</commit_message>
<xml_diff>
--- a/backend_flask/plantillas_word/Anexo I.1 compensación beca.docx
+++ b/backend_flask/plantillas_word/Anexo I.1 compensación beca.docx
@@ -1746,15 +1746,6 @@
     </w:tbl>
     <w:p>
       <w:pPr>
-        <w:jc w:val="center"/>
-        <w:rPr>
-          <w:sz w:val="20"/>
-          <w:szCs w:val="20"/>
-        </w:rPr>
-      </w:pPr>
-    </w:p>
-    <w:p>
-      <w:pPr>
         <w:rPr>
           <w:sz w:val="14"/>
           <w:szCs w:val="14"/>
@@ -2444,17 +2435,6 @@
         </w:tc>
       </w:tr>
     </w:tbl>
-    <w:p>
-      <w:pPr>
-        <w:jc w:val="both"/>
-        <w:rPr>
-          <w:i/>
-          <w:iCs/>
-          <w:sz w:val="16"/>
-          <w:szCs w:val="16"/>
-        </w:rPr>
-      </w:pPr>
-    </w:p>
     <w:p>
       <w:pPr>
         <w:jc w:val="both"/>
@@ -4884,32 +4864,6 @@
       <w:lang w:eastAsia="en-US"/>
     </w:rPr>
   </w:style>
-  <w:style w:type="paragraph" w:customStyle="1" w:styleId="00F546698A8D48BE98635477096E240C">
-    <w:name w:val="00F546698A8D48BE98635477096E240C"/>
-    <w:rsid w:val="00AF2BB5"/>
-    <w:pPr>
-      <w:spacing w:line="259" w:lineRule="auto"/>
-    </w:pPr>
-    <w:rPr>
-      <w:rFonts w:eastAsiaTheme="minorHAnsi"/>
-      <w:sz w:val="22"/>
-      <w:szCs w:val="22"/>
-      <w:lang w:eastAsia="en-US"/>
-    </w:rPr>
-  </w:style>
-  <w:style w:type="paragraph" w:customStyle="1" w:styleId="BA8F7A2FD9B34671BB850F2FCD3A20B9">
-    <w:name w:val="BA8F7A2FD9B34671BB850F2FCD3A20B9"/>
-    <w:rsid w:val="00AF2BB5"/>
-    <w:pPr>
-      <w:spacing w:line="259" w:lineRule="auto"/>
-    </w:pPr>
-    <w:rPr>
-      <w:rFonts w:eastAsiaTheme="minorHAnsi"/>
-      <w:sz w:val="22"/>
-      <w:szCs w:val="22"/>
-      <w:lang w:eastAsia="en-US"/>
-    </w:rPr>
-  </w:style>
   <w:style w:type="paragraph" w:customStyle="1" w:styleId="56735A12136A4C4D893FEA84E21134B91">
     <w:name w:val="56735A12136A4C4D893FEA84E21134B91"/>
     <w:rsid w:val="00AF2BB5"/>

</xml_diff>